<commit_message>
Document verified model sizes and fit timings for ESI
</commit_message>
<xml_diff>
--- a/source_verified_v2/documents/ESI_20260925_Round2/Documents/ESI_MainText.docx
+++ b/source_verified_v2/documents/ESI_20260925_Round2/Documents/ESI_MainText.docx
@@ -9273,6 +9273,18 @@
     </w:p>
     <w:p>
       <w:pPr>
+        <w:spacing w:line="360" w:lineRule="auto" w:after="120"/>
+      </w:pPr>
+      <w:r>
+        <w:rPr>
+          <w:rFonts w:ascii="Times New Roman" w:hAnsi="Times New Roman"/>
+          <w:sz w:val="24"/>
+        </w:rPr>
+        <w:t>Checkpoint inspection gives 16,611 trainable parameters for CNN, 10,467 for TCN, 108,355 for the full 15-channel I-CNN and 269,051 for PhaseNetMatched, identically in both component modes. Counts include biases and batch-normalization scale/offset, but exclude running statistics. The 106 recorded fit durations sum to approximately 16.73 h; this is cumulative successful-fit wall-clock time, not end-to-end pipeline time. Preparation, OOF generation, evaluation, checkpoint serialization and interrupted attempts are excluded. Per-model durations and ablation counts appear in Online Resource 1, Table S31. A complete replay wall-clock measurement is unavailable; a retained partial-run timer is explicitly scoped in that resource.</w:t>
+      </w:r>
+    </w:p>
+    <w:p>
+      <w:pPr>
         <w:keepNext/>
         <w:spacing w:after="120" w:line="360" w:lineRule="auto"/>
       </w:pPr>
@@ -9878,7 +9890,7 @@
                 <w:b w:val="0"/>
                 <w:sz w:val="18"/>
               </w:rPr>
-              <w:t>Zonly</w:t>
+              <w:t>Z-only</w:t>
             </w:r>
           </w:p>
         </w:tc>
@@ -10120,7 +10132,7 @@
                 <w:b w:val="0"/>
                 <w:sz w:val="18"/>
               </w:rPr>
-              <w:t>Zonly</w:t>
+              <w:t>Z-only</w:t>
             </w:r>
           </w:p>
         </w:tc>
@@ -10391,7 +10403,7 @@
                 <w:b w:val="0"/>
                 <w:sz w:val="18"/>
               </w:rPr>
-              <w:t>Stack Full3C minus Zonly</w:t>
+              <w:t>Stack Full3C minus Z-only</w:t>
             </w:r>
           </w:p>
         </w:tc>
@@ -10476,7 +10488,7 @@
                 <w:b w:val="0"/>
                 <w:sz w:val="18"/>
               </w:rPr>
-              <w:t>PhaseNet Full3C minus Zonly</w:t>
+              <w:t>PhaseNetMatched Full3C minus Z-only</w:t>
             </w:r>
           </w:p>
         </w:tc>
@@ -10561,7 +10573,7 @@
                 <w:b w:val="0"/>
                 <w:sz w:val="18"/>
               </w:rPr>
-              <w:t>Stack minus PhaseNet Full3C</w:t>
+              <w:t>Stack minus PhaseNetMatched Full3C</w:t>
             </w:r>
           </w:p>
         </w:tc>
@@ -10646,7 +10658,7 @@
                 <w:b w:val="0"/>
                 <w:sz w:val="18"/>
               </w:rPr>
-              <w:t>Stack minus PhaseNet Zonly</w:t>
+              <w:t>Stack minus PhaseNetMatched Z-only</w:t>
             </w:r>
           </w:p>
         </w:tc>
@@ -10731,7 +10743,7 @@
                 <w:b w:val="0"/>
                 <w:sz w:val="18"/>
               </w:rPr>
-              <w:t>Stack Full3C minus Zonly</w:t>
+              <w:t>Stack Full3C minus Z-only</w:t>
             </w:r>
           </w:p>
         </w:tc>
@@ -10816,7 +10828,7 @@
                 <w:b w:val="0"/>
                 <w:sz w:val="18"/>
               </w:rPr>
-              <w:t>PhaseNet Full3C minus Zonly</w:t>
+              <w:t>PhaseNetMatched Full3C minus Z-only</w:t>
             </w:r>
           </w:p>
         </w:tc>
@@ -10901,7 +10913,7 @@
                 <w:b w:val="0"/>
                 <w:sz w:val="18"/>
               </w:rPr>
-              <w:t>Stack minus PhaseNet Full3C</w:t>
+              <w:t>Stack minus PhaseNetMatched Full3C</w:t>
             </w:r>
           </w:p>
         </w:tc>
@@ -10986,7 +10998,7 @@
                 <w:b w:val="0"/>
                 <w:sz w:val="18"/>
               </w:rPr>
-              <w:t>Stack minus PhaseNet Zonly</w:t>
+              <w:t>Stack minus PhaseNetMatched Z-only</w:t>
             </w:r>
           </w:p>
         </w:tc>
@@ -12508,7 +12520,7 @@
           <w:rFonts w:ascii="Times New Roman" w:hAnsi="Times New Roman"/>
           <w:sz w:val="24"/>
         </w:rPr>
-        <w:t>Online Resource 1 (ESM_1.pdf) contains supplementary figures S1–S14 and tables S1–S30, covering feature statistics, secondary base-42 results, hyperparameters, provenance, historical roles, replay and sensitivity diagnostics. The accompanying reconstruction script and receipts document the HDF5-to-CSV check.</w:t>
+        <w:t>Online Resource 1 (ESM_1.pdf) contains supplementary figures S1–S14 and tables S1–S31, covering feature statistics, secondary base-42 results, hyperparameters, provenance, historical roles, replay and sensitivity diagnostics. The accompanying reconstruction script and receipts document the HDF5-to-CSV check.</w:t>
       </w:r>
     </w:p>
     <w:p>

</xml_diff>